<commit_message>
almost done with major edits
</commit_message>
<xml_diff>
--- a/B401_Poster_11pt.docx
+++ b/B401_Poster_11pt.docx
@@ -3255,7 +3255,7 @@
           <w:rFonts w:ascii="Times New Roman" w:hAnsi="Times New Roman" w:cs="Times New Roman"/>
           <w:color w:val="111111"/>
         </w:rPr>
-        <w:t>Greeks evaluated at S=EUR 1,708, T=1.79 y, σ=44.7% (median rolling vol). Certificate value EUR 1,452.87.</w:t>
+        <w:t>Greeks evaluated at S=EUR 1,708, T=1.79 y, σ=44.7% (median rolling vol). Certificate value EUR 1,443.73.</w:t>
       </w:r>
     </w:p>
     <w:tbl>
@@ -3417,7 +3417,7 @@
                 <w:rFonts w:ascii="Times New Roman" w:hAnsi="Times New Roman" w:cs="Times New Roman"/>
                 <w:color w:val="111111"/>
               </w:rPr>
-              <w:t>0.602</w:t>
+              <w:t>0.515</w:t>
             </w:r>
           </w:p>
         </w:tc>
@@ -3505,7 +3505,7 @@
                 <w:rFonts w:ascii="Times New Roman" w:hAnsi="Times New Roman" w:cs="Times New Roman"/>
                 <w:color w:val="111111"/>
               </w:rPr>
-              <w:t>−0.0004</w:t>
+              <w:t>−0.0006</w:t>
             </w:r>
           </w:p>
         </w:tc>
@@ -3607,7 +3607,7 @@
                 <w:rFonts w:ascii="Times New Roman" w:hAnsi="Times New Roman" w:cs="Times New Roman"/>
                 <w:color w:val="111111"/>
               </w:rPr>
-              <w:t>−14.37</w:t>
+              <w:t>−13.12</w:t>
             </w:r>
           </w:p>
         </w:tc>
@@ -3652,7 +3652,7 @@
           <w:rFonts w:ascii="Times New Roman" w:hAnsi="Times New Roman" w:cs="Times New Roman"/>
           <w:color w:val="111111"/>
         </w:rPr>
-        <w:t>Theta +0.36 EUR/day: passing time reduces barrier risk. Rho −12.4 EUR per +1pp: the bonus payment is discounted like a bond.</w:t>
+        <w:t>Theta +0.52 EUR/day: passing time reduces barrier risk. Rho −12.1 EUR per +1pp: the bonus payment is discounted like a bond.</w:t>
       </w:r>
     </w:p>
     <w:p>
@@ -3752,7 +3752,7 @@
           <w:rFonts w:ascii="Times New Roman" w:hAnsi="Times New Roman" w:cs="Times New Roman"/>
           <w:color w:val="111111"/>
         </w:rPr>
-        <w:t>Daily replication from the tree: V(t)=Δ(t)·S(t)+B(t). Delta ran from 0.14 to 1.07. The equity fraction Δ·S/V ran from 16% to 112% and was above 50% on 143 of 183 days. As RHM fell toward the barrier, Delta rose to 1 and the bond leg turned negative. The certificate concentrates stock exposure exactly when the market falls, the opposite of a capital-protected note. Below the barrier the payoff becomes a capped forward and the equity fraction sits near 81%, rising toward 98%.</w:t>
+        <w:t>Daily replication from the tree: V(t)=Δ(t)·S(t)+B(t). Delta ran from 0.20 to 1.06. The equity fraction Δ·S/V ran from 22% to 110% and was above 50% on 152 of 183 days. As RHM fell toward the barrier, Delta rose to 1 and the bond leg turned negative. The certificate concentrates stock exposure exactly when the market falls, the opposite of a capital-protected note. Below the barrier the payoff becomes a capped forward and the equity fraction sits near 81%, rising toward 98%.</w:t>
       </w:r>
     </w:p>
     <w:p>

</xml_diff>